<commit_message>
Adopt the crew voice throughout (Rhoads-standard wording)
Voice codified in content-rules: short declarative sentences, actors doing
things, the why riding with each rule, homeowner by name, STOP-and-call
escalation to a named contact, caps only on risk words, pre-empted
confusion, captions as instructions. New structure from the same standard:
Key Gates sign-off block, per-trade install-week orientation, trade-routed
crew notes, day-headline book-these-dates lines, Homeowner-phone label.
Sample job and templates rewritten in the voice.
</commit_message>
<xml_diff>
--- a/examples/resilient-retrofits/jobs/alder-st/output/Work Order - ELECTRICAL - Alder - 2026-07-29.docx
+++ b/examples/resilient-retrofits/jobs/alder-st/output/Work Order - ELECTRICAL - Alder - 2026-07-29.docx
@@ -267,7 +267,7 @@
                 <w:b/>
                 <w:sz w:val="20"/>
               </w:rPr>
-              <w:t>Phone</w:t>
+              <w:t>Homeowner phone</w:t>
             </w:r>
           </w:p>
         </w:tc>
@@ -354,7 +354,7 @@
                 <w:rFonts w:ascii="Arial" w:hAnsi="Arial"/>
                 <w:sz w:val="20"/>
               </w:rPr>
-              <w:t>Kyle — (503) 555-0117</w:t>
+              <w:t>Kyle Kanooth, Project Manager — (503) 555-0117</w:t>
             </w:r>
           </w:p>
         </w:tc>
@@ -548,7 +548,38 @@
           <w:color w:val="C0504D"/>
           <w:sz w:val="22"/>
         </w:rPr>
-        <w:t>⚠  SAFETY FLAGS: LEAD PAINT — 1962 home, lead-safe (RRP) practices on any paint disturbance</w:t>
+        <w:t>⚠  SAFETY FLAGS: LEAD PAINT — 1962 home. Use lead-safe (RRP) practices any time you disturb paint.</w:t>
+      </w:r>
+    </w:p>
+    <w:p>
+      <w:pPr>
+        <w:spacing w:before="200" w:after="80"/>
+        <w:pBdr>
+          <w:bottom w:val="single" w:sz="8" w:space="1" w:color="7BA05B"/>
+        </w:pBdr>
+      </w:pPr>
+      <w:r>
+        <w:rPr>
+          <w:rFonts w:ascii="Arial" w:hAnsi="Arial"/>
+          <w:b/>
+          <w:color w:val="2D5016"/>
+          <w:sz w:val="24"/>
+        </w:rPr>
+        <w:t>This Trade in the Install Week</w:t>
+      </w:r>
+    </w:p>
+    <w:p>
+      <w:pPr>
+        <w:spacing w:before="40" w:after="40"/>
+      </w:pPr>
+      <w:r>
+        <w:rPr>
+          <w:rFonts w:ascii="Arial" w:hAnsi="Arial"/>
+          <w:b w:val="0"/>
+          <w:i w:val="0"/>
+          <w:sz w:val="20"/>
+        </w:rPr>
+        <w:t>•  Day 1 (Mon) — Furnace out + attic open + air-seal start</w:t>
       </w:r>
     </w:p>
     <w:p>
@@ -695,7 +726,7 @@
                 <w:rFonts w:ascii="Arial" w:hAnsi="Arial"/>
                 <w:sz w:val="18"/>
               </w:rPr>
-              <w:t>New 240V circuit for heat pump</w:t>
+              <w:t>New 240V circuit for the heat pump</w:t>
             </w:r>
           </w:p>
         </w:tc>
@@ -723,7 +754,7 @@
                 <w:rFonts w:ascii="Arial" w:hAnsi="Arial"/>
                 <w:sz w:val="18"/>
               </w:rPr>
-              <w:t>25A 2-pole breaker, 10/2 from panel to east-wall disconnect, whip to ODU</w:t>
+              <w:t>25A 2-pole breaker, 10/2 from the panel to the east-wall disconnect, whip to the ODU.</w:t>
             </w:r>
           </w:p>
         </w:tc>
@@ -1460,7 +1491,7 @@
           <w:i w:val="0"/>
           <w:sz w:val="20"/>
         </w:rPr>
-        <w:t>•  Homeowner is on video calls in the back office — knock at the front door, headphones mean go around</w:t>
+        <w:t>•  Casey is on video calls in the back office. Knock at the front door. Headphones mean go around.</w:t>
       </w:r>
     </w:p>
     <w:p>
@@ -1474,7 +1505,7 @@
           <w:i w:val="0"/>
           <w:sz w:val="20"/>
         </w:rPr>
-        <w:t>•  Keep the driveway clear of material staging after 4pm (street sweeping Tuesday)</w:t>
+        <w:t>•  The cat is friendly and sneaky. Check for her before closing the attic hatch.</w:t>
       </w:r>
     </w:p>
     <w:p>
@@ -1488,7 +1519,7 @@
           <w:i w:val="0"/>
           <w:sz w:val="20"/>
         </w:rPr>
-        <w:t>•  Cat is friendly and sneaky — check for her before closing the attic hatch</w:t>
+        <w:t>•  The panel is in the garage, two spare spaces lower right. Land the circuit there and label it HEAT PUMP.</w:t>
       </w:r>
     </w:p>
     <w:p>
@@ -1616,7 +1647,7 @@
                 <w:i/>
                 <w:sz w:val="16"/>
               </w:rPr>
-              <w:t>Panel in garage — ODU circuit lands in the spare spaces, lower right</w:t>
+              <w:t>Panel in the garage. Land the ONE new 25A/240V heat-pump circuit in the spare spaces, lower right. Label it HEAT PUMP.</w:t>
             </w:r>
           </w:p>
         </w:tc>
@@ -1634,7 +1665,7 @@
                 <w:i/>
                 <w:sz w:val="16"/>
               </w:rPr>
-              <w:t>East wall ODU location — pad here, lineset penetration sealed after ducts run</w:t>
+              <w:t>East wall. The ODU pad goes here. Seal the lineset penetration after the ducts run.</w:t>
             </w:r>
           </w:p>
         </w:tc>

</xml_diff>